<commit_message>
Update resume with blue gray layout and portrait
</commit_message>
<xml_diff>
--- a/downloads/resume.docx
+++ b/downloads/resume.docx
@@ -2,114 +2,731 @@
 <file path=word/document.xml><?xml version="1.0" encoding="utf-8"?>
 <w:document xmlns:wpc="http://schemas.microsoft.com/office/word/2010/wordprocessingCanvas" xmlns:mo="http://schemas.microsoft.com/office/mac/office/2008/main" xmlns:mc="http://schemas.openxmlformats.org/markup-compatibility/2006" xmlns:mv="urn:schemas-microsoft-com:mac:vml" xmlns:o="urn:schemas-microsoft-com:office:office" xmlns:r="http://schemas.openxmlformats.org/officeDocument/2006/relationships" xmlns:m="http://schemas.openxmlformats.org/officeDocument/2006/math" xmlns:v="urn:schemas-microsoft-com:vml" xmlns:wp14="http://schemas.microsoft.com/office/word/2010/wordprocessingDrawing" xmlns:wp="http://schemas.openxmlformats.org/drawingml/2006/wordprocessingDrawing" xmlns:w10="urn:schemas-microsoft-com:office:word" xmlns:w="http://schemas.openxmlformats.org/wordprocessingml/2006/main" xmlns:w14="http://schemas.microsoft.com/office/word/2010/wordml" xmlns:wpg="http://schemas.microsoft.com/office/word/2010/wordprocessingGroup" xmlns:wpi="http://schemas.microsoft.com/office/word/2010/wordprocessingInk" xmlns:wne="http://schemas.microsoft.com/office/word/2006/wordml" xmlns:wps="http://schemas.microsoft.com/office/word/2010/wordprocessingShape" mc:Ignorable="w14 wp14">
   <w:body>
+    <w:tbl>
+      <w:tblPr>
+        <w:tblW w:type="auto" w:w="0"/>
+        <w:tblLayout w:type="fixed"/>
+        <w:tblLook w:firstColumn="1" w:firstRow="1" w:lastColumn="0" w:lastRow="0" w:noHBand="0" w:noVBand="1" w:val="04A0"/>
+      </w:tblPr>
+      <w:tblGrid>
+        <w:gridCol w:w="6624"/>
+        <w:gridCol w:w="3355"/>
+      </w:tblGrid>
+      <w:tr>
+        <w:tc>
+          <w:tcPr>
+            <w:tcW w:type="dxa" w:w="6624"/>
+            <w:tcMar>
+              <w:top w:w="0" w:type="dxa"/>
+              <w:start w:w="0" w:type="dxa"/>
+              <w:bottom w:w="0" w:type="dxa"/>
+              <w:end w:w="0" w:type="dxa"/>
+            </w:tcMar>
+          </w:tcPr>
+          <w:p>
+            <w:pPr>
+              <w:pStyle w:val="Title"/>
+              <w:keepNext w:val="0"/>
+              <w:spacing w:before="0" w:after="0" w:line="240" w:lineRule="auto"/>
+            </w:pPr>
+            <w:r>
+              <w:rPr>
+                <w:rFonts w:ascii="Microsoft YaHei" w:hAnsi="Microsoft YaHei" w:eastAsia="Microsoft YaHei"/>
+                <w:b w:val="0"/>
+                <w:color w:val="456875"/>
+                <w:sz w:val="60"/>
+              </w:rPr>
+              <w:t>个人简历</w:t>
+            </w:r>
+          </w:p>
+        </w:tc>
+        <w:tc>
+          <w:tcPr>
+            <w:tcW w:type="dxa" w:w="3355"/>
+            <w:tcMar>
+              <w:top w:w="0" w:type="dxa"/>
+              <w:start w:w="0" w:type="dxa"/>
+              <w:bottom w:w="0" w:type="dxa"/>
+              <w:end w:w="0" w:type="dxa"/>
+            </w:tcMar>
+          </w:tcPr>
+          <w:p>
+            <w:pPr>
+              <w:keepNext w:val="0"/>
+              <w:spacing w:before="200" w:after="0" w:line="240" w:lineRule="auto"/>
+              <w:jc w:val="right"/>
+            </w:pPr>
+            <w:r>
+              <w:rPr>
+                <w:rFonts w:ascii="Microsoft YaHei" w:hAnsi="Microsoft YaHei" w:eastAsia="Microsoft YaHei"/>
+                <w:b/>
+                <w:color w:val="C5A66E"/>
+                <w:sz w:val="16"/>
+              </w:rPr>
+              <w:t>PHOTOGRAPHY  /  VISUAL CONTENT</w:t>
+            </w:r>
+          </w:p>
+        </w:tc>
+      </w:tr>
+    </w:tbl>
+    <w:tbl>
+      <w:tblPr>
+        <w:tblW w:type="auto" w:w="0"/>
+        <w:tblLayout w:type="fixed"/>
+        <w:tblLook w:firstColumn="1" w:firstRow="1" w:lastColumn="0" w:lastRow="0" w:noHBand="0" w:noVBand="1" w:val="04A0"/>
+      </w:tblPr>
+      <w:tblGrid>
+        <w:gridCol w:w="6120"/>
+        <w:gridCol w:w="3859"/>
+      </w:tblGrid>
+      <w:tr>
+        <w:trPr>
+          <w:trHeight w:val="187" w:hRule="exact"/>
+        </w:trPr>
+        <w:tc>
+          <w:tcPr>
+            <w:tcW w:type="dxa" w:w="4989"/>
+            <w:tcMar>
+              <w:top w:w="0" w:type="dxa"/>
+              <w:start w:w="0" w:type="dxa"/>
+              <w:bottom w:w="0" w:type="dxa"/>
+              <w:end w:w="0" w:type="dxa"/>
+            </w:tcMar>
+            <w:shd w:fill="456875"/>
+          </w:tcPr>
+          <w:p>
+            <w:r/>
+          </w:p>
+        </w:tc>
+        <w:tc>
+          <w:tcPr>
+            <w:tcW w:type="dxa" w:w="4989"/>
+            <w:tcMar>
+              <w:top w:w="0" w:type="dxa"/>
+              <w:start w:w="0" w:type="dxa"/>
+              <w:bottom w:w="0" w:type="dxa"/>
+              <w:end w:w="0" w:type="dxa"/>
+            </w:tcMar>
+            <w:shd w:fill="C5A66E"/>
+          </w:tcPr>
+          <w:p>
+            <w:r/>
+          </w:p>
+        </w:tc>
+      </w:tr>
+    </w:tbl>
     <w:p>
       <w:pPr>
-        <w:pStyle w:val="Title"/>
+        <w:keepNext w:val="0"/>
+        <w:spacing w:before="120" w:after="0" w:line="96" w:lineRule="auto"/>
+      </w:pPr>
+    </w:p>
+    <w:tbl>
+      <w:tblPr>
+        <w:tblW w:type="auto" w:w="0"/>
+        <w:tblLayout w:type="fixed"/>
+        <w:tblLook w:firstColumn="1" w:firstRow="1" w:lastColumn="0" w:lastRow="0" w:noHBand="0" w:noVBand="1" w:val="04A0"/>
+      </w:tblPr>
+      <w:tblGrid>
+        <w:gridCol w:w="1656"/>
+        <w:gridCol w:w="403"/>
+        <w:gridCol w:w="7920"/>
+      </w:tblGrid>
+      <w:tr>
+        <w:trPr>
+          <w:trHeight w:val="374" w:hRule="atLeast"/>
+        </w:trPr>
+        <w:tc>
+          <w:tcPr>
+            <w:tcW w:type="dxa" w:w="3326"/>
+            <w:tcMar>
+              <w:top w:w="15" w:type="dxa"/>
+              <w:start w:w="90" w:type="dxa"/>
+              <w:bottom w:w="15" w:type="dxa"/>
+              <w:end w:w="0" w:type="dxa"/>
+            </w:tcMar>
+            <w:vAlign w:val="center"/>
+            <w:shd w:fill="456875"/>
+          </w:tcPr>
+          <w:p>
+            <w:pPr>
+              <w:keepNext w:val="0"/>
+              <w:spacing w:before="0" w:after="0" w:line="240" w:lineRule="auto"/>
+            </w:pPr>
+            <w:r>
+              <w:rPr>
+                <w:rFonts w:ascii="Microsoft YaHei" w:hAnsi="Microsoft YaHei" w:eastAsia="Microsoft YaHei"/>
+                <w:b w:val="0"/>
+                <w:color w:val="FFFFFF"/>
+                <w:sz w:val="20"/>
+              </w:rPr>
+              <w:t>基本信息</w:t>
+            </w:r>
+          </w:p>
+        </w:tc>
+        <w:tc>
+          <w:tcPr>
+            <w:tcW w:type="dxa" w:w="3326"/>
+            <w:tcMar>
+              <w:top w:w="15" w:type="dxa"/>
+              <w:start w:w="90" w:type="dxa"/>
+              <w:bottom w:w="15" w:type="dxa"/>
+              <w:end w:w="0" w:type="dxa"/>
+            </w:tcMar>
+            <w:vAlign w:val="center"/>
+            <w:shd w:fill="9DB6BE"/>
+          </w:tcPr>
+          <w:p>
+            <w:r/>
+          </w:p>
+        </w:tc>
+        <w:tc>
+          <w:tcPr>
+            <w:tcW w:type="dxa" w:w="3326"/>
+            <w:tcMar>
+              <w:top w:w="15" w:type="dxa"/>
+              <w:start w:w="90" w:type="dxa"/>
+              <w:bottom w:w="15" w:type="dxa"/>
+              <w:end w:w="0" w:type="dxa"/>
+            </w:tcMar>
+            <w:vAlign w:val="center"/>
+            <w:tcBorders>
+              <w:bottom w:val="single" w:sz="7" w:color="8FA7AF"/>
+            </w:tcBorders>
+          </w:tcPr>
+          <w:p>
+            <w:r/>
+          </w:p>
+        </w:tc>
+      </w:tr>
+    </w:tbl>
+    <w:p>
+      <w:pPr>
+        <w:keepNext w:val="0"/>
+        <w:spacing w:before="0" w:after="0" w:line="60" w:lineRule="auto"/>
+      </w:pPr>
+    </w:p>
+    <w:tbl>
+      <w:tblPr>
+        <w:tblW w:type="auto" w:w="0"/>
+        <w:tblLayout w:type="fixed"/>
+        <w:tblLook w:firstColumn="1" w:firstRow="1" w:lastColumn="0" w:lastRow="0" w:noHBand="0" w:noVBand="1" w:val="04A0"/>
+      </w:tblPr>
+      <w:tblGrid>
+        <w:gridCol w:w="8525"/>
+        <w:gridCol w:w="1454"/>
+      </w:tblGrid>
+      <w:tr>
+        <w:tc>
+          <w:tcPr>
+            <w:tcW w:type="dxa" w:w="8525"/>
+            <w:vAlign w:val="top"/>
+            <w:tcMar>
+              <w:top w:w="20" w:type="dxa"/>
+              <w:start w:w="140" w:type="dxa"/>
+              <w:bottom w:w="0" w:type="dxa"/>
+              <w:end w:w="0" w:type="dxa"/>
+            </w:tcMar>
+          </w:tcPr>
+          <w:p>
+            <w:pPr>
+              <w:keepNext w:val="0"/>
+              <w:spacing w:before="0" w:after="60" w:line="240" w:lineRule="auto"/>
+            </w:pPr>
+            <w:r>
+              <w:rPr>
+                <w:rFonts w:ascii="Microsoft YaHei" w:hAnsi="Microsoft YaHei" w:eastAsia="Microsoft YaHei"/>
+                <w:b/>
+                <w:color w:val="263238"/>
+                <w:sz w:val="33"/>
+              </w:rPr>
+              <w:t>刘淼鑫燚</w:t>
+            </w:r>
+            <w:r>
+              <w:rPr>
+                <w:rFonts w:ascii="Microsoft YaHei" w:hAnsi="Microsoft YaHei" w:eastAsia="Microsoft YaHei"/>
+                <w:b w:val="0"/>
+                <w:color w:val="667278"/>
+                <w:sz w:val="19"/>
+              </w:rPr>
+              <w:t xml:space="preserve">   摄影与视觉内容</w:t>
+            </w:r>
+          </w:p>
+          <w:p>
+            <w:pPr>
+              <w:keepNext w:val="0"/>
+              <w:spacing w:before="0" w:after="40" w:line="259" w:lineRule="auto"/>
+            </w:pPr>
+            <w:r>
+              <w:rPr>
+                <w:rFonts w:ascii="Microsoft YaHei" w:hAnsi="Microsoft YaHei" w:eastAsia="Microsoft YaHei"/>
+                <w:b/>
+                <w:color w:val="456875"/>
+                <w:sz w:val="18"/>
+              </w:rPr>
+              <w:t xml:space="preserve">学校与专业  </w:t>
+            </w:r>
+            <w:r>
+              <w:rPr>
+                <w:rFonts w:ascii="Microsoft YaHei" w:hAnsi="Microsoft YaHei" w:eastAsia="Microsoft YaHei"/>
+                <w:b w:val="0"/>
+                <w:color w:val="263238"/>
+                <w:sz w:val="18"/>
+              </w:rPr>
+              <w:t>湖北美术学院 · 视觉艺术设计学院 · 摄影专业</w:t>
+            </w:r>
+          </w:p>
+          <w:p>
+            <w:pPr>
+              <w:keepNext w:val="0"/>
+              <w:spacing w:before="0" w:after="40" w:line="259" w:lineRule="auto"/>
+            </w:pPr>
+            <w:r>
+              <w:rPr>
+                <w:rFonts w:ascii="Microsoft YaHei" w:hAnsi="Microsoft YaHei" w:eastAsia="Microsoft YaHei"/>
+                <w:b/>
+                <w:color w:val="456875"/>
+                <w:sz w:val="18"/>
+              </w:rPr>
+              <w:t xml:space="preserve">学历与状态  </w:t>
+            </w:r>
+            <w:r>
+              <w:rPr>
+                <w:rFonts w:ascii="Microsoft YaHei" w:hAnsi="Microsoft YaHei" w:eastAsia="Microsoft YaHei"/>
+                <w:b w:val="0"/>
+                <w:color w:val="263238"/>
+                <w:sz w:val="18"/>
+              </w:rPr>
+              <w:t>2023 级本科在读</w:t>
+            </w:r>
+          </w:p>
+          <w:p>
+            <w:pPr>
+              <w:keepNext w:val="0"/>
+              <w:spacing w:before="0" w:after="40" w:line="259" w:lineRule="auto"/>
+            </w:pPr>
+            <w:r>
+              <w:rPr>
+                <w:rFonts w:ascii="Microsoft YaHei" w:hAnsi="Microsoft YaHei" w:eastAsia="Microsoft YaHei"/>
+                <w:b/>
+                <w:color w:val="456875"/>
+                <w:sz w:val="18"/>
+              </w:rPr>
+              <w:t xml:space="preserve">求职方向  </w:t>
+            </w:r>
+            <w:r>
+              <w:rPr>
+                <w:rFonts w:ascii="Microsoft YaHei" w:hAnsi="Microsoft YaHei" w:eastAsia="Microsoft YaHei"/>
+                <w:b w:val="0"/>
+                <w:color w:val="263238"/>
+                <w:sz w:val="18"/>
+              </w:rPr>
+              <w:t>摄影师助理 / 商业静物摄影 / 视觉内容制作</w:t>
+            </w:r>
+          </w:p>
+          <w:p>
+            <w:pPr>
+              <w:keepNext w:val="0"/>
+              <w:spacing w:before="0" w:after="40" w:line="259" w:lineRule="auto"/>
+            </w:pPr>
+            <w:r>
+              <w:rPr>
+                <w:rFonts w:ascii="Microsoft YaHei" w:hAnsi="Microsoft YaHei" w:eastAsia="Microsoft YaHei"/>
+                <w:b/>
+                <w:color w:val="456875"/>
+                <w:sz w:val="18"/>
+              </w:rPr>
+              <w:t xml:space="preserve">联系电话  </w:t>
+            </w:r>
+            <w:r>
+              <w:rPr>
+                <w:rFonts w:ascii="Microsoft YaHei" w:hAnsi="Microsoft YaHei" w:eastAsia="Microsoft YaHei"/>
+                <w:b w:val="0"/>
+                <w:color w:val="263238"/>
+                <w:sz w:val="18"/>
+              </w:rPr>
+              <w:t>19072596637</w:t>
+            </w:r>
+          </w:p>
+          <w:p>
+            <w:pPr>
+              <w:keepNext w:val="0"/>
+              <w:spacing w:before="0" w:after="40" w:line="259" w:lineRule="auto"/>
+            </w:pPr>
+            <w:r>
+              <w:rPr>
+                <w:rFonts w:ascii="Microsoft YaHei" w:hAnsi="Microsoft YaHei" w:eastAsia="Microsoft YaHei"/>
+                <w:b/>
+                <w:color w:val="456875"/>
+                <w:sz w:val="18"/>
+              </w:rPr>
+              <w:t xml:space="preserve">电子邮箱  </w:t>
+            </w:r>
+            <w:r>
+              <w:rPr>
+                <w:rFonts w:ascii="Microsoft YaHei" w:hAnsi="Microsoft YaHei" w:eastAsia="Microsoft YaHei"/>
+                <w:b w:val="0"/>
+                <w:color w:val="263238"/>
+                <w:sz w:val="18"/>
+              </w:rPr>
+              <w:t>2023050697@qq.com</w:t>
+            </w:r>
+          </w:p>
+          <w:p>
+            <w:pPr>
+              <w:keepNext w:val="0"/>
+              <w:spacing w:before="0" w:after="0" w:line="240" w:lineRule="auto"/>
+            </w:pPr>
+            <w:r>
+              <w:rPr>
+                <w:rFonts w:ascii="Microsoft YaHei" w:hAnsi="Microsoft YaHei" w:eastAsia="Microsoft YaHei"/>
+                <w:b/>
+                <w:color w:val="456875"/>
+                <w:sz w:val="18"/>
+              </w:rPr>
+              <w:t xml:space="preserve">在线作品集  </w:t>
+            </w:r>
+            <w:hyperlink r:id="rId9">
+              <w:r>
+                <w:rPr>
+                  <w:color w:val="456875"/>
+                  <w:sz w:val="16"/>
+                </w:rPr>
+                <w:t>masterxy-21.github.io/photography-portfolio/</w:t>
+              </w:r>
+            </w:hyperlink>
+          </w:p>
+        </w:tc>
+        <w:tc>
+          <w:tcPr>
+            <w:tcW w:type="dxa" w:w="1454"/>
+            <w:vAlign w:val="top"/>
+            <w:tcMar>
+              <w:top w:w="0" w:type="dxa"/>
+              <w:start w:w="0" w:type="dxa"/>
+              <w:bottom w:w="0" w:type="dxa"/>
+              <w:end w:w="0" w:type="dxa"/>
+            </w:tcMar>
+          </w:tcPr>
+          <w:p>
+            <w:pPr>
+              <w:keepNext w:val="0"/>
+              <w:spacing w:before="0" w:after="0" w:line="240" w:lineRule="auto"/>
+              <w:jc w:val="right"/>
+            </w:pPr>
+            <w:r>
+              <w:drawing>
+                <wp:inline xmlns:a="http://schemas.openxmlformats.org/drawingml/2006/main" xmlns:pic="http://schemas.openxmlformats.org/drawingml/2006/picture">
+                  <wp:extent cx="896112" cy="1307592"/>
+                  <wp:docPr id="1" name="Picture 1"/>
+                  <wp:cNvGraphicFramePr>
+                    <a:graphicFrameLocks noChangeAspect="1"/>
+                  </wp:cNvGraphicFramePr>
+                  <a:graphic>
+                    <a:graphicData uri="http://schemas.openxmlformats.org/drawingml/2006/picture">
+                      <pic:pic>
+                        <pic:nvPicPr>
+                          <pic:cNvPr id="0" name="刘淼鑫燚_蓝底证件照.png"/>
+                          <pic:cNvPicPr/>
+                        </pic:nvPicPr>
+                        <pic:blipFill>
+                          <a:blip r:embed="rId10"/>
+                          <a:stretch>
+                            <a:fillRect/>
+                          </a:stretch>
+                        </pic:blipFill>
+                        <pic:spPr>
+                          <a:xfrm>
+                            <a:off x="0" y="0"/>
+                            <a:ext cx="896112" cy="1307592"/>
+                          </a:xfrm>
+                          <a:prstGeom prst="rect"/>
+                        </pic:spPr>
+                      </pic:pic>
+                    </a:graphicData>
+                  </a:graphic>
+                </wp:inline>
+              </w:drawing>
+            </w:r>
+          </w:p>
+        </w:tc>
+      </w:tr>
+    </w:tbl>
+    <w:p>
+      <w:pPr>
+        <w:keepNext w:val="0"/>
+        <w:spacing w:before="120" w:after="0" w:line="96" w:lineRule="auto"/>
+      </w:pPr>
+    </w:p>
+    <w:tbl>
+      <w:tblPr>
+        <w:tblW w:type="auto" w:w="0"/>
+        <w:tblLayout w:type="fixed"/>
+        <w:tblLook w:firstColumn="1" w:firstRow="1" w:lastColumn="0" w:lastRow="0" w:noHBand="0" w:noVBand="1" w:val="04A0"/>
+      </w:tblPr>
+      <w:tblGrid>
+        <w:gridCol w:w="1656"/>
+        <w:gridCol w:w="403"/>
+        <w:gridCol w:w="7920"/>
+      </w:tblGrid>
+      <w:tr>
+        <w:trPr>
+          <w:trHeight w:val="374" w:hRule="atLeast"/>
+        </w:trPr>
+        <w:tc>
+          <w:tcPr>
+            <w:tcW w:type="dxa" w:w="3326"/>
+            <w:tcMar>
+              <w:top w:w="15" w:type="dxa"/>
+              <w:start w:w="90" w:type="dxa"/>
+              <w:bottom w:w="15" w:type="dxa"/>
+              <w:end w:w="0" w:type="dxa"/>
+            </w:tcMar>
+            <w:vAlign w:val="center"/>
+            <w:shd w:fill="456875"/>
+          </w:tcPr>
+          <w:p>
+            <w:pPr>
+              <w:keepNext w:val="0"/>
+              <w:spacing w:before="0" w:after="0" w:line="240" w:lineRule="auto"/>
+            </w:pPr>
+            <w:r>
+              <w:rPr>
+                <w:rFonts w:ascii="Microsoft YaHei" w:hAnsi="Microsoft YaHei" w:eastAsia="Microsoft YaHei"/>
+                <w:b w:val="0"/>
+                <w:color w:val="FFFFFF"/>
+                <w:sz w:val="20"/>
+              </w:rPr>
+              <w:t>教育背景</w:t>
+            </w:r>
+          </w:p>
+        </w:tc>
+        <w:tc>
+          <w:tcPr>
+            <w:tcW w:type="dxa" w:w="3326"/>
+            <w:tcMar>
+              <w:top w:w="15" w:type="dxa"/>
+              <w:start w:w="90" w:type="dxa"/>
+              <w:bottom w:w="15" w:type="dxa"/>
+              <w:end w:w="0" w:type="dxa"/>
+            </w:tcMar>
+            <w:vAlign w:val="center"/>
+            <w:shd w:fill="9DB6BE"/>
+          </w:tcPr>
+          <w:p>
+            <w:r/>
+          </w:p>
+        </w:tc>
+        <w:tc>
+          <w:tcPr>
+            <w:tcW w:type="dxa" w:w="3326"/>
+            <w:tcMar>
+              <w:top w:w="15" w:type="dxa"/>
+              <w:start w:w="90" w:type="dxa"/>
+              <w:bottom w:w="15" w:type="dxa"/>
+              <w:end w:w="0" w:type="dxa"/>
+            </w:tcMar>
+            <w:vAlign w:val="center"/>
+            <w:tcBorders>
+              <w:bottom w:val="single" w:sz="7" w:color="8FA7AF"/>
+            </w:tcBorders>
+          </w:tcPr>
+          <w:p>
+            <w:r/>
+          </w:p>
+        </w:tc>
+      </w:tr>
+    </w:tbl>
+    <w:p>
+      <w:pPr>
+        <w:keepNext w:val="0"/>
+        <w:spacing w:before="0" w:after="0" w:line="60" w:lineRule="auto"/>
+      </w:pPr>
+    </w:p>
+    <w:p>
+      <w:pPr>
+        <w:keepNext w:val="0"/>
+        <w:tabs>
+          <w:tab w:pos="9821" w:val="right"/>
+        </w:tabs>
+        <w:spacing w:before="0" w:after="40" w:line="264" w:lineRule="auto"/>
       </w:pPr>
       <w:r>
         <w:rPr>
           <w:rFonts w:ascii="Microsoft YaHei" w:hAnsi="Microsoft YaHei" w:eastAsia="Microsoft YaHei"/>
           <w:b/>
-          <w:color w:val="000000"/>
-          <w:sz w:val="38"/>
+          <w:color w:val="263238"/>
+          <w:sz w:val="20"/>
         </w:rPr>
-        <w:t>刘淼鑫燚 摄影与视觉内容简历</w:t>
+        <w:t>湖北美术学院</w:t>
+      </w:r>
+      <w:r>
+        <w:rPr>
+          <w:rFonts w:ascii="Microsoft YaHei" w:hAnsi="Microsoft YaHei" w:eastAsia="Microsoft YaHei"/>
+          <w:b w:val="0"/>
+          <w:color w:val="263238"/>
+          <w:sz w:val="18"/>
+        </w:rPr>
+        <w:t xml:space="preserve">   视觉艺术设计学院 · 摄影专业（本科在读）</w:t>
+      </w:r>
+      <w:r>
+        <w:rPr>
+          <w:rFonts w:ascii="Microsoft YaHei" w:hAnsi="Microsoft YaHei" w:eastAsia="Microsoft YaHei"/>
+          <w:b w:val="0"/>
+          <w:color w:val="667278"/>
+          <w:sz w:val="17"/>
+        </w:rPr>
+        <w:tab/>
+        <w:t>2023.09—至今</w:t>
       </w:r>
     </w:p>
     <w:p>
       <w:pPr>
-        <w:spacing w:after="40"/>
-      </w:pPr>
-      <w:r>
-        <w:rPr>
-          <w:rFonts w:ascii="Microsoft YaHei" w:hAnsi="Microsoft YaHei" w:eastAsia="Microsoft YaHei"/>
-          <w:b w:val="0"/>
-          <w:color w:val="4C4C4C"/>
-          <w:sz w:val="18"/>
-        </w:rPr>
-        <w:t>湖北美术学院 · 视觉艺术设计学院 · 摄影专业本科在读（2023级）</w:t>
-      </w:r>
-    </w:p>
-    <w:p>
-      <w:pPr>
-        <w:spacing w:after="40"/>
-      </w:pPr>
-      <w:r>
-        <w:rPr>
-          <w:rFonts w:ascii="Microsoft YaHei" w:hAnsi="Microsoft YaHei" w:eastAsia="Microsoft YaHei"/>
-          <w:b w:val="0"/>
-          <w:color w:val="000000"/>
-          <w:sz w:val="18"/>
-        </w:rPr>
-        <w:t>求职方向：摄影师助理 / 商业静物摄影 / 视觉内容制作</w:t>
-      </w:r>
-    </w:p>
-    <w:p>
-      <w:pPr>
-        <w:spacing w:after="80"/>
-      </w:pPr>
-      <w:r>
-        <w:rPr>
-          <w:rFonts w:ascii="Microsoft YaHei" w:hAnsi="Microsoft YaHei" w:eastAsia="Microsoft YaHei"/>
-          <w:b w:val="0"/>
-          <w:color w:val="000000"/>
-          <w:sz w:val="18"/>
-        </w:rPr>
-        <w:t>电话：19072596637    邮箱：2023050697@qq.com    作品集：PDF 随附</w:t>
-      </w:r>
-    </w:p>
-    <w:p>
-      <w:pPr>
-        <w:pStyle w:val="Heading1"/>
-      </w:pPr>
-      <w:r>
-        <w:t>个人概述</w:t>
-      </w:r>
-    </w:p>
-    <w:p>
-      <w:pPr>
-        <w:spacing w:after="20"/>
-      </w:pPr>
-      <w:r>
-        <w:rPr>
-          <w:rFonts w:ascii="Microsoft YaHei" w:hAnsi="Microsoft YaHei" w:eastAsia="Microsoft YaHei"/>
-          <w:b w:val="0"/>
-          <w:color w:val="000000"/>
-          <w:sz w:val="18"/>
-        </w:rPr>
-        <w:t>摄影专业本科在读，作品涵盖时尚人像、茶叶产品静物、建筑摄影和数字图像。具备前期视觉方案、拍摄顺序规划、现场布光协作、Photoshop 后期及素材整理经验。</w:t>
-      </w:r>
-    </w:p>
-    <w:p>
-      <w:pPr>
-        <w:pStyle w:val="Heading1"/>
-      </w:pPr>
-      <w:r>
-        <w:t>项目与作品</w:t>
-      </w:r>
-    </w:p>
-    <w:p>
-      <w:pPr>
-        <w:pStyle w:val="ProjectHeading"/>
-        <w:tabs>
-          <w:tab w:pos="10035" w:val="right"/>
-        </w:tabs>
+        <w:keepNext w:val="0"/>
+        <w:spacing w:before="0" w:after="0" w:line="264" w:lineRule="auto"/>
       </w:pPr>
       <w:r>
         <w:rPr>
           <w:rFonts w:ascii="Microsoft YaHei" w:hAnsi="Microsoft YaHei" w:eastAsia="Microsoft YaHei"/>
           <w:b/>
-          <w:color w:val="000000"/>
-          <w:sz w:val="19"/>
+          <w:color w:val="456875"/>
+          <w:sz w:val="18"/>
         </w:rPr>
-        <w:t>BROWN ATTITUDE 棕色姿态  时尚摄影三人小组项目</w:t>
+        <w:t>创作方向：</w:t>
       </w:r>
       <w:r>
         <w:rPr>
           <w:rFonts w:ascii="Microsoft YaHei" w:hAnsi="Microsoft YaHei" w:eastAsia="Microsoft YaHei"/>
           <w:b w:val="0"/>
-          <w:color w:val="4C4C4C"/>
+          <w:color w:val="263238"/>
           <w:sz w:val="18"/>
+        </w:rPr>
+        <w:t>时尚人像、商业静物、建筑摄影与数字影像。</w:t>
+      </w:r>
+    </w:p>
+    <w:p>
+      <w:pPr>
+        <w:keepNext w:val="0"/>
+        <w:spacing w:before="120" w:after="0" w:line="96" w:lineRule="auto"/>
+      </w:pPr>
+    </w:p>
+    <w:tbl>
+      <w:tblPr>
+        <w:tblW w:type="auto" w:w="0"/>
+        <w:tblLayout w:type="fixed"/>
+        <w:tblLook w:firstColumn="1" w:firstRow="1" w:lastColumn="0" w:lastRow="0" w:noHBand="0" w:noVBand="1" w:val="04A0"/>
+      </w:tblPr>
+      <w:tblGrid>
+        <w:gridCol w:w="1656"/>
+        <w:gridCol w:w="403"/>
+        <w:gridCol w:w="7920"/>
+      </w:tblGrid>
+      <w:tr>
+        <w:trPr>
+          <w:trHeight w:val="374" w:hRule="atLeast"/>
+        </w:trPr>
+        <w:tc>
+          <w:tcPr>
+            <w:tcW w:type="dxa" w:w="3326"/>
+            <w:tcMar>
+              <w:top w:w="15" w:type="dxa"/>
+              <w:start w:w="90" w:type="dxa"/>
+              <w:bottom w:w="15" w:type="dxa"/>
+              <w:end w:w="0" w:type="dxa"/>
+            </w:tcMar>
+            <w:vAlign w:val="center"/>
+            <w:shd w:fill="456875"/>
+          </w:tcPr>
+          <w:p>
+            <w:pPr>
+              <w:keepNext w:val="0"/>
+              <w:spacing w:before="0" w:after="0" w:line="240" w:lineRule="auto"/>
+            </w:pPr>
+            <w:r>
+              <w:rPr>
+                <w:rFonts w:ascii="Microsoft YaHei" w:hAnsi="Microsoft YaHei" w:eastAsia="Microsoft YaHei"/>
+                <w:b w:val="0"/>
+                <w:color w:val="FFFFFF"/>
+                <w:sz w:val="20"/>
+              </w:rPr>
+              <w:t>项目实践</w:t>
+            </w:r>
+          </w:p>
+        </w:tc>
+        <w:tc>
+          <w:tcPr>
+            <w:tcW w:type="dxa" w:w="3326"/>
+            <w:tcMar>
+              <w:top w:w="15" w:type="dxa"/>
+              <w:start w:w="90" w:type="dxa"/>
+              <w:bottom w:w="15" w:type="dxa"/>
+              <w:end w:w="0" w:type="dxa"/>
+            </w:tcMar>
+            <w:vAlign w:val="center"/>
+            <w:shd w:fill="9DB6BE"/>
+          </w:tcPr>
+          <w:p>
+            <w:r/>
+          </w:p>
+        </w:tc>
+        <w:tc>
+          <w:tcPr>
+            <w:tcW w:type="dxa" w:w="3326"/>
+            <w:tcMar>
+              <w:top w:w="15" w:type="dxa"/>
+              <w:start w:w="90" w:type="dxa"/>
+              <w:bottom w:w="15" w:type="dxa"/>
+              <w:end w:w="0" w:type="dxa"/>
+            </w:tcMar>
+            <w:vAlign w:val="center"/>
+            <w:tcBorders>
+              <w:bottom w:val="single" w:sz="7" w:color="8FA7AF"/>
+            </w:tcBorders>
+          </w:tcPr>
+          <w:p>
+            <w:r/>
+          </w:p>
+        </w:tc>
+      </w:tr>
+    </w:tbl>
+    <w:p>
+      <w:pPr>
+        <w:keepNext w:val="0"/>
+        <w:spacing w:before="0" w:after="0" w:line="60" w:lineRule="auto"/>
+      </w:pPr>
+    </w:p>
+    <w:p>
+      <w:pPr>
+        <w:keepNext/>
+        <w:tabs>
+          <w:tab w:pos="9821" w:val="right"/>
+        </w:tabs>
+        <w:spacing w:before="20" w:after="20" w:line="252" w:lineRule="auto"/>
+      </w:pPr>
+      <w:r>
+        <w:rPr>
+          <w:rFonts w:ascii="Microsoft YaHei" w:hAnsi="Microsoft YaHei" w:eastAsia="Microsoft YaHei"/>
+          <w:b/>
+          <w:color w:val="263238"/>
+          <w:sz w:val="19"/>
+        </w:rPr>
+        <w:t>BROWN ATTITUDE 棕色姿态</w:t>
+      </w:r>
+      <w:r>
+        <w:rPr>
+          <w:rFonts w:ascii="Microsoft YaHei" w:hAnsi="Microsoft YaHei" w:eastAsia="Microsoft YaHei"/>
+          <w:b w:val="0"/>
+          <w:color w:val="667278"/>
+          <w:sz w:val="17"/>
+        </w:rPr>
+        <w:t xml:space="preserve">  ·  时尚摄影三人小组</w:t>
+      </w:r>
+      <w:r>
+        <w:rPr>
+          <w:rFonts w:ascii="Microsoft YaHei" w:hAnsi="Microsoft YaHei" w:eastAsia="Microsoft YaHei"/>
+          <w:b w:val="0"/>
+          <w:color w:val="667278"/>
+          <w:sz w:val="17"/>
         </w:rPr>
         <w:tab/>
         <w:t>2026.10</w:t>
@@ -117,58 +734,52 @@
     </w:p>
     <w:p>
       <w:pPr>
-        <w:keepLines/>
-        <w:spacing w:after="40"/>
-        <w:ind w:left="193" w:hanging="153"/>
+        <w:keepNext w:val="0"/>
+        <w:spacing w:before="0" w:after="100" w:line="271" w:lineRule="auto"/>
+        <w:ind w:left="230" w:hanging="173"/>
       </w:pPr>
       <w:r>
         <w:rPr>
           <w:rFonts w:ascii="Microsoft YaHei" w:hAnsi="Microsoft YaHei" w:eastAsia="Microsoft YaHei"/>
           <w:b w:val="0"/>
-          <w:color w:val="000000"/>
+          <w:color w:val="263238"/>
           <w:sz w:val="18"/>
         </w:rPr>
-        <w:t>•  制作前期策划 PPT 并完成课堂汇报，规划全身、半身、近景三组画面的动作、机位和灯位预案。</w:t>
+        <w:t>•  制作前期策划 PPT 与拍摄方案，规划景别、动作和机位；参与现场布光，并独立拍摄系列中的近景肖像。</w:t>
       </w:r>
     </w:p>
     <w:p>
       <w:pPr>
-        <w:keepLines/>
-        <w:spacing w:after="40"/>
-        <w:ind w:left="193" w:hanging="153"/>
-      </w:pPr>
-      <w:r>
-        <w:rPr>
-          <w:rFonts w:ascii="Microsoft YaHei" w:hAnsi="Microsoft YaHei" w:eastAsia="Microsoft YaHei"/>
-          <w:b w:val="0"/>
-          <w:color w:val="000000"/>
-          <w:sz w:val="18"/>
-        </w:rPr>
-        <w:t>•  参与拍摄顺序安排和现场布光；本人拍摄墨镜下拉的近景肖像。系列成片与棚拍原图对照已收录作品集。</w:t>
-      </w:r>
-    </w:p>
-    <w:p>
-      <w:pPr>
-        <w:pStyle w:val="ProjectHeading"/>
+        <w:keepNext/>
         <w:tabs>
-          <w:tab w:pos="10035" w:val="right"/>
+          <w:tab w:pos="9821" w:val="right"/>
         </w:tabs>
+        <w:spacing w:before="20" w:after="20" w:line="252" w:lineRule="auto"/>
       </w:pPr>
       <w:r>
         <w:rPr>
           <w:rFonts w:ascii="Microsoft YaHei" w:hAnsi="Microsoft YaHei" w:eastAsia="Microsoft YaHei"/>
           <w:b/>
-          <w:color w:val="000000"/>
+          <w:color w:val="263238"/>
           <w:sz w:val="19"/>
         </w:rPr>
-        <w:t>商业静物摄影  茶叶产品视觉</w:t>
+        <w:t>茶叶产品视觉</w:t>
       </w:r>
       <w:r>
         <w:rPr>
           <w:rFonts w:ascii="Microsoft YaHei" w:hAnsi="Microsoft YaHei" w:eastAsia="Microsoft YaHei"/>
           <w:b w:val="0"/>
-          <w:color w:val="4C4C4C"/>
-          <w:sz w:val="18"/>
+          <w:color w:val="667278"/>
+          <w:sz w:val="17"/>
+        </w:rPr>
+        <w:t xml:space="preserve">  ·  商业静物摄影课程作品</w:t>
+      </w:r>
+      <w:r>
+        <w:rPr>
+          <w:rFonts w:ascii="Microsoft YaHei" w:hAnsi="Microsoft YaHei" w:eastAsia="Microsoft YaHei"/>
+          <w:b w:val="0"/>
+          <w:color w:val="667278"/>
+          <w:sz w:val="17"/>
         </w:rPr>
         <w:tab/>
         <w:t>课程作品</w:t>
@@ -176,128 +787,105 @@
     </w:p>
     <w:p>
       <w:pPr>
-        <w:keepLines/>
-        <w:spacing w:after="40"/>
-        <w:ind w:left="193" w:hanging="153"/>
+        <w:keepNext w:val="0"/>
+        <w:spacing w:before="0" w:after="100" w:line="271" w:lineRule="auto"/>
+        <w:ind w:left="230" w:hanging="173"/>
       </w:pPr>
       <w:r>
         <w:rPr>
           <w:rFonts w:ascii="Microsoft YaHei" w:hAnsi="Microsoft YaHei" w:eastAsia="Microsoft YaHei"/>
           <w:b w:val="0"/>
-          <w:color w:val="000000"/>
+          <w:color w:val="263238"/>
           <w:sz w:val="18"/>
         </w:rPr>
-        <w:t>•  围绕红茶和绿色茶罐分别搭建红黑、同色系布景，借助茶具、木质道具与枝花组织产品情境，完成拍摄和基础后期。</w:t>
+        <w:t>•  围绕红茶包装与绿色茶罐搭建两组布景，使用茶具、木质道具及枝花组织画面，完成拍摄与基础后期。</w:t>
       </w:r>
     </w:p>
     <w:p>
       <w:pPr>
-        <w:pStyle w:val="ProjectHeading"/>
+        <w:keepNext/>
         <w:tabs>
-          <w:tab w:pos="10035" w:val="right"/>
+          <w:tab w:pos="9821" w:val="right"/>
         </w:tabs>
+        <w:spacing w:before="20" w:after="20" w:line="252" w:lineRule="auto"/>
       </w:pPr>
       <w:r>
         <w:rPr>
           <w:rFonts w:ascii="Microsoft YaHei" w:hAnsi="Microsoft YaHei" w:eastAsia="Microsoft YaHei"/>
           <w:b/>
-          <w:color w:val="000000"/>
+          <w:color w:val="263238"/>
           <w:sz w:val="19"/>
         </w:rPr>
-        <w:t>汉服购买决策调研与视觉传播  团队项目</w:t>
+        <w:t>屏幕之中的人</w:t>
       </w:r>
       <w:r>
         <w:rPr>
           <w:rFonts w:ascii="Microsoft YaHei" w:hAnsi="Microsoft YaHei" w:eastAsia="Microsoft YaHei"/>
           <w:b w:val="0"/>
-          <w:color w:val="4C4C4C"/>
-          <w:sz w:val="18"/>
+          <w:color w:val="667278"/>
+          <w:sz w:val="17"/>
+        </w:rPr>
+        <w:t xml:space="preserve">  ·  AI 图像与实验短片</w:t>
+      </w:r>
+      <w:r>
+        <w:rPr>
+          <w:rFonts w:ascii="Microsoft YaHei" w:hAnsi="Microsoft YaHei" w:eastAsia="Microsoft YaHei"/>
+          <w:b w:val="0"/>
+          <w:color w:val="667278"/>
+          <w:sz w:val="17"/>
         </w:rPr>
         <w:tab/>
-        <w:t>2026.05</w:t>
+        <w:t>2026.10</w:t>
       </w:r>
     </w:p>
     <w:p>
       <w:pPr>
-        <w:keepLines/>
-        <w:spacing w:after="40"/>
-        <w:ind w:left="193" w:hanging="153"/>
+        <w:keepNext w:val="0"/>
+        <w:spacing w:before="0" w:after="100" w:line="271" w:lineRule="auto"/>
+        <w:ind w:left="230" w:hanging="173"/>
       </w:pPr>
       <w:r>
         <w:rPr>
           <w:rFonts w:ascii="Microsoft YaHei" w:hAnsi="Microsoft YaHei" w:eastAsia="Microsoft YaHei"/>
           <w:b w:val="0"/>
-          <w:color w:val="000000"/>
+          <w:color w:val="263238"/>
           <w:sz w:val="18"/>
         </w:rPr>
-        <w:t>•  与组员共同完成 9 次访谈，使用 NVivo 整理、编码内容；共同承担文案、图片与海报排版，将调研发现转化为视觉呈现。</w:t>
+        <w:t>•  以电子屏幕代替人物面孔创作系列图像；结合 AI 视频生成与后期剪辑，完成约 29 秒的实验短片。</w:t>
       </w:r>
     </w:p>
     <w:p>
       <w:pPr>
-        <w:pStyle w:val="ProjectHeading"/>
+        <w:keepNext/>
         <w:tabs>
-          <w:tab w:pos="10035" w:val="right"/>
+          <w:tab w:pos="9821" w:val="right"/>
         </w:tabs>
+        <w:spacing w:before="20" w:after="20" w:line="252" w:lineRule="auto"/>
       </w:pPr>
       <w:r>
         <w:rPr>
           <w:rFonts w:ascii="Microsoft YaHei" w:hAnsi="Microsoft YaHei" w:eastAsia="Microsoft YaHei"/>
           <w:b/>
-          <w:color w:val="000000"/>
+          <w:color w:val="263238"/>
           <w:sz w:val="19"/>
         </w:rPr>
-        <w:t>虚拟图像  电子屏幕头部系列</w:t>
+        <w:t>古楼映江城</w:t>
       </w:r>
       <w:r>
         <w:rPr>
           <w:rFonts w:ascii="Microsoft YaHei" w:hAnsi="Microsoft YaHei" w:eastAsia="Microsoft YaHei"/>
           <w:b w:val="0"/>
-          <w:color w:val="4C4C4C"/>
-          <w:sz w:val="18"/>
+          <w:color w:val="667278"/>
+          <w:sz w:val="17"/>
         </w:rPr>
-        <w:tab/>
-        <w:t>2026.09</w:t>
-      </w:r>
-    </w:p>
-    <w:p>
-      <w:pPr>
-        <w:keepLines/>
-        <w:spacing w:after="40"/>
-        <w:ind w:left="193" w:hanging="153"/>
-      </w:pPr>
-      <w:r>
-        <w:rPr>
-          <w:rFonts w:ascii="Microsoft YaHei" w:hAnsi="Microsoft YaHei" w:eastAsia="Microsoft YaHei"/>
-          <w:b w:val="0"/>
-          <w:color w:val="000000"/>
-          <w:sz w:val="18"/>
-        </w:rPr>
-        <w:t>•  以“屏幕代替面孔”为概念，借助 AI 生成街道、课堂、食堂和通勤等场景的九幅图像，并用 Photoshop 修正人物透视、边缘与文字。</w:t>
-      </w:r>
-    </w:p>
-    <w:p>
-      <w:pPr>
-        <w:pStyle w:val="ProjectHeading"/>
-        <w:tabs>
-          <w:tab w:pos="10035" w:val="right"/>
-        </w:tabs>
-      </w:pPr>
-      <w:r>
-        <w:rPr>
-          <w:rFonts w:ascii="Microsoft YaHei" w:hAnsi="Microsoft YaHei" w:eastAsia="Microsoft YaHei"/>
-          <w:b/>
-          <w:color w:val="000000"/>
-          <w:sz w:val="19"/>
-        </w:rPr>
-        <w:t>古楼映江城  武汉建筑摄影系列</w:t>
+        <w:t xml:space="preserve">  ·  武汉建筑摄影系列</w:t>
       </w:r>
       <w:r>
         <w:rPr>
           <w:rFonts w:ascii="Microsoft YaHei" w:hAnsi="Microsoft YaHei" w:eastAsia="Microsoft YaHei"/>
           <w:b w:val="0"/>
-          <w:color w:val="4C4C4C"/>
-          <w:sz w:val="18"/>
+          <w:color w:val="667278"/>
+          <w:sz w:val="17"/>
         </w:rPr>
         <w:tab/>
         <w:t>2025.10</w:t>
@@ -305,95 +893,407 @@
     </w:p>
     <w:p>
       <w:pPr>
-        <w:keepLines/>
-        <w:spacing w:after="40"/>
-        <w:ind w:left="193" w:hanging="153"/>
+        <w:keepNext w:val="0"/>
+        <w:spacing w:before="0" w:after="100" w:line="271" w:lineRule="auto"/>
+        <w:ind w:left="230" w:hanging="173"/>
       </w:pPr>
       <w:r>
         <w:rPr>
           <w:rFonts w:ascii="Microsoft YaHei" w:hAnsi="Microsoft YaHei" w:eastAsia="Microsoft YaHei"/>
           <w:b w:val="0"/>
-          <w:color w:val="000000"/>
+          <w:color w:val="263238"/>
           <w:sz w:val="18"/>
         </w:rPr>
-        <w:t>•  围绕黄鹤楼屋檐、檐角与结构细节完成多角度取景；整理 CR3、DNG 原片、XMP 调整记录和 TIF 成片。</w:t>
+        <w:t>•  拍摄黄鹤楼屋檐、檐角与结构细节，完成系列编排，并整理 CR3 原片、调整记录与 TIF 成片。</w:t>
       </w:r>
     </w:p>
     <w:p>
       <w:pPr>
-        <w:pStyle w:val="Heading1"/>
+        <w:keepNext w:val="0"/>
+        <w:spacing w:before="120" w:after="0" w:line="96" w:lineRule="auto"/>
+      </w:pPr>
+    </w:p>
+    <w:tbl>
+      <w:tblPr>
+        <w:tblW w:type="auto" w:w="0"/>
+        <w:tblLayout w:type="fixed"/>
+        <w:tblLook w:firstColumn="1" w:firstRow="1" w:lastColumn="0" w:lastRow="0" w:noHBand="0" w:noVBand="1" w:val="04A0"/>
+      </w:tblPr>
+      <w:tblGrid>
+        <w:gridCol w:w="1656"/>
+        <w:gridCol w:w="403"/>
+        <w:gridCol w:w="7920"/>
+      </w:tblGrid>
+      <w:tr>
+        <w:trPr>
+          <w:trHeight w:val="374" w:hRule="atLeast"/>
+        </w:trPr>
+        <w:tc>
+          <w:tcPr>
+            <w:tcW w:type="dxa" w:w="3326"/>
+            <w:tcMar>
+              <w:top w:w="15" w:type="dxa"/>
+              <w:start w:w="90" w:type="dxa"/>
+              <w:bottom w:w="15" w:type="dxa"/>
+              <w:end w:w="0" w:type="dxa"/>
+            </w:tcMar>
+            <w:vAlign w:val="center"/>
+            <w:shd w:fill="456875"/>
+          </w:tcPr>
+          <w:p>
+            <w:pPr>
+              <w:keepNext w:val="0"/>
+              <w:spacing w:before="0" w:after="0" w:line="240" w:lineRule="auto"/>
+            </w:pPr>
+            <w:r>
+              <w:rPr>
+                <w:rFonts w:ascii="Microsoft YaHei" w:hAnsi="Microsoft YaHei" w:eastAsia="Microsoft YaHei"/>
+                <w:b w:val="0"/>
+                <w:color w:val="FFFFFF"/>
+                <w:sz w:val="20"/>
+              </w:rPr>
+              <w:t>校园经历</w:t>
+            </w:r>
+          </w:p>
+        </w:tc>
+        <w:tc>
+          <w:tcPr>
+            <w:tcW w:type="dxa" w:w="3326"/>
+            <w:tcMar>
+              <w:top w:w="15" w:type="dxa"/>
+              <w:start w:w="90" w:type="dxa"/>
+              <w:bottom w:w="15" w:type="dxa"/>
+              <w:end w:w="0" w:type="dxa"/>
+            </w:tcMar>
+            <w:vAlign w:val="center"/>
+            <w:shd w:fill="9DB6BE"/>
+          </w:tcPr>
+          <w:p>
+            <w:r/>
+          </w:p>
+        </w:tc>
+        <w:tc>
+          <w:tcPr>
+            <w:tcW w:type="dxa" w:w="3326"/>
+            <w:tcMar>
+              <w:top w:w="15" w:type="dxa"/>
+              <w:start w:w="90" w:type="dxa"/>
+              <w:bottom w:w="15" w:type="dxa"/>
+              <w:end w:w="0" w:type="dxa"/>
+            </w:tcMar>
+            <w:vAlign w:val="center"/>
+            <w:tcBorders>
+              <w:bottom w:val="single" w:sz="7" w:color="8FA7AF"/>
+            </w:tcBorders>
+          </w:tcPr>
+          <w:p>
+            <w:r/>
+          </w:p>
+        </w:tc>
+      </w:tr>
+    </w:tbl>
+    <w:p>
+      <w:pPr>
+        <w:keepNext w:val="0"/>
+        <w:spacing w:before="0" w:after="0" w:line="60" w:lineRule="auto"/>
+      </w:pPr>
+    </w:p>
+    <w:p>
+      <w:pPr>
+        <w:keepNext w:val="0"/>
+        <w:spacing w:before="0" w:after="0" w:line="276" w:lineRule="auto"/>
       </w:pPr>
       <w:r>
-        <w:t>专业能力</w:t>
+        <w:rPr>
+          <w:rFonts w:ascii="Microsoft YaHei" w:hAnsi="Microsoft YaHei" w:eastAsia="Microsoft YaHei"/>
+          <w:b/>
+          <w:color w:val="263238"/>
+          <w:sz w:val="18"/>
+        </w:rPr>
+        <w:t xml:space="preserve">学院团委调研部干事  </w:t>
+      </w:r>
+      <w:r>
+        <w:rPr>
+          <w:rFonts w:ascii="Microsoft YaHei" w:hAnsi="Microsoft YaHei" w:eastAsia="Microsoft YaHei"/>
+          <w:b w:val="0"/>
+          <w:color w:val="263238"/>
+          <w:sz w:val="18"/>
+        </w:rPr>
+        <w:t>2023.09—2024.09   参与校园推文撰写与秀米排版，配合部门日常内容工作。</w:t>
       </w:r>
     </w:p>
     <w:p>
       <w:pPr>
-        <w:spacing w:after="40"/>
+        <w:keepNext w:val="0"/>
+        <w:spacing w:before="120" w:after="0" w:line="96" w:lineRule="auto"/>
+      </w:pPr>
+    </w:p>
+    <w:tbl>
+      <w:tblPr>
+        <w:tblW w:type="auto" w:w="0"/>
+        <w:tblLayout w:type="fixed"/>
+        <w:tblLook w:firstColumn="1" w:firstRow="1" w:lastColumn="0" w:lastRow="0" w:noHBand="0" w:noVBand="1" w:val="04A0"/>
+      </w:tblPr>
+      <w:tblGrid>
+        <w:gridCol w:w="1656"/>
+        <w:gridCol w:w="403"/>
+        <w:gridCol w:w="7920"/>
+      </w:tblGrid>
+      <w:tr>
+        <w:trPr>
+          <w:trHeight w:val="374" w:hRule="atLeast"/>
+        </w:trPr>
+        <w:tc>
+          <w:tcPr>
+            <w:tcW w:type="dxa" w:w="3326"/>
+            <w:tcMar>
+              <w:top w:w="15" w:type="dxa"/>
+              <w:start w:w="90" w:type="dxa"/>
+              <w:bottom w:w="15" w:type="dxa"/>
+              <w:end w:w="0" w:type="dxa"/>
+            </w:tcMar>
+            <w:vAlign w:val="center"/>
+            <w:shd w:fill="456875"/>
+          </w:tcPr>
+          <w:p>
+            <w:pPr>
+              <w:keepNext w:val="0"/>
+              <w:spacing w:before="0" w:after="0" w:line="240" w:lineRule="auto"/>
+            </w:pPr>
+            <w:r>
+              <w:rPr>
+                <w:rFonts w:ascii="Microsoft YaHei" w:hAnsi="Microsoft YaHei" w:eastAsia="Microsoft YaHei"/>
+                <w:b w:val="0"/>
+                <w:color w:val="FFFFFF"/>
+                <w:sz w:val="20"/>
+              </w:rPr>
+              <w:t>专业技能</w:t>
+            </w:r>
+          </w:p>
+        </w:tc>
+        <w:tc>
+          <w:tcPr>
+            <w:tcW w:type="dxa" w:w="3326"/>
+            <w:tcMar>
+              <w:top w:w="15" w:type="dxa"/>
+              <w:start w:w="90" w:type="dxa"/>
+              <w:bottom w:w="15" w:type="dxa"/>
+              <w:end w:w="0" w:type="dxa"/>
+            </w:tcMar>
+            <w:vAlign w:val="center"/>
+            <w:shd w:fill="9DB6BE"/>
+          </w:tcPr>
+          <w:p>
+            <w:r/>
+          </w:p>
+        </w:tc>
+        <w:tc>
+          <w:tcPr>
+            <w:tcW w:type="dxa" w:w="3326"/>
+            <w:tcMar>
+              <w:top w:w="15" w:type="dxa"/>
+              <w:start w:w="90" w:type="dxa"/>
+              <w:bottom w:w="15" w:type="dxa"/>
+              <w:end w:w="0" w:type="dxa"/>
+            </w:tcMar>
+            <w:vAlign w:val="center"/>
+            <w:tcBorders>
+              <w:bottom w:val="single" w:sz="7" w:color="8FA7AF"/>
+            </w:tcBorders>
+          </w:tcPr>
+          <w:p>
+            <w:r/>
+          </w:p>
+        </w:tc>
+      </w:tr>
+    </w:tbl>
+    <w:p>
+      <w:pPr>
+        <w:keepNext w:val="0"/>
+        <w:spacing w:before="0" w:after="0" w:line="60" w:lineRule="auto"/>
+      </w:pPr>
+    </w:p>
+    <w:p>
+      <w:pPr>
+        <w:keepNext w:val="0"/>
+        <w:spacing w:before="0" w:after="60" w:line="269" w:lineRule="auto"/>
+      </w:pPr>
+      <w:r>
+        <w:rPr>
+          <w:rFonts w:ascii="Microsoft YaHei" w:hAnsi="Microsoft YaHei" w:eastAsia="Microsoft YaHei"/>
+          <w:b/>
+          <w:color w:val="456875"/>
+          <w:sz w:val="18"/>
+        </w:rPr>
+        <w:t xml:space="preserve">摄影与现场  </w:t>
+      </w:r>
+      <w:r>
+        <w:rPr>
+          <w:rFonts w:ascii="Microsoft YaHei" w:hAnsi="Microsoft YaHei" w:eastAsia="Microsoft YaHei"/>
+          <w:b w:val="0"/>
+          <w:color w:val="263238"/>
+          <w:sz w:val="18"/>
+        </w:rPr>
+        <w:t>产品静物布景与基础用光、影棚布光协作、机位与景别规划。</w:t>
+      </w:r>
+    </w:p>
+    <w:p>
+      <w:pPr>
+        <w:keepNext w:val="0"/>
+        <w:spacing w:before="0" w:after="60" w:line="269" w:lineRule="auto"/>
+      </w:pPr>
+      <w:r>
+        <w:rPr>
+          <w:rFonts w:ascii="Microsoft YaHei" w:hAnsi="Microsoft YaHei" w:eastAsia="Microsoft YaHei"/>
+          <w:b/>
+          <w:color w:val="456875"/>
+          <w:sz w:val="18"/>
+        </w:rPr>
+        <w:t xml:space="preserve">后期与交付  </w:t>
+      </w:r>
+      <w:r>
+        <w:rPr>
+          <w:rFonts w:ascii="Microsoft YaHei" w:hAnsi="Microsoft YaHei" w:eastAsia="Microsoft YaHei"/>
+          <w:b w:val="0"/>
+          <w:color w:val="263238"/>
+          <w:sz w:val="18"/>
+        </w:rPr>
+        <w:t>Photoshop 修图与合成；CR3、DNG、XMP、TIF 文件整理。</w:t>
+      </w:r>
+    </w:p>
+    <w:p>
+      <w:pPr>
+        <w:keepNext w:val="0"/>
+        <w:spacing w:before="0" w:after="60" w:line="269" w:lineRule="auto"/>
+      </w:pPr>
+      <w:r>
+        <w:rPr>
+          <w:rFonts w:ascii="Microsoft YaHei" w:hAnsi="Microsoft YaHei" w:eastAsia="Microsoft YaHei"/>
+          <w:b/>
+          <w:color w:val="456875"/>
+          <w:sz w:val="18"/>
+        </w:rPr>
+        <w:t xml:space="preserve">视觉表达  </w:t>
+      </w:r>
+      <w:r>
+        <w:rPr>
+          <w:rFonts w:ascii="Microsoft YaHei" w:hAnsi="Microsoft YaHei" w:eastAsia="Microsoft YaHei"/>
+          <w:b w:val="0"/>
+          <w:color w:val="263238"/>
+          <w:sz w:val="18"/>
+        </w:rPr>
+        <w:t>拍摄策划与 PPT 汇报、AI 图像迭代、基础视频剪辑。</w:t>
+      </w:r>
+    </w:p>
+    <w:p>
+      <w:pPr>
+        <w:keepNext w:val="0"/>
+        <w:spacing w:before="120" w:after="0" w:line="96" w:lineRule="auto"/>
+      </w:pPr>
+    </w:p>
+    <w:tbl>
+      <w:tblPr>
+        <w:tblW w:type="auto" w:w="0"/>
+        <w:tblLayout w:type="fixed"/>
+        <w:tblLook w:firstColumn="1" w:firstRow="1" w:lastColumn="0" w:lastRow="0" w:noHBand="0" w:noVBand="1" w:val="04A0"/>
+      </w:tblPr>
+      <w:tblGrid>
+        <w:gridCol w:w="1656"/>
+        <w:gridCol w:w="403"/>
+        <w:gridCol w:w="7920"/>
+      </w:tblGrid>
+      <w:tr>
+        <w:trPr>
+          <w:trHeight w:val="374" w:hRule="atLeast"/>
+        </w:trPr>
+        <w:tc>
+          <w:tcPr>
+            <w:tcW w:type="dxa" w:w="3326"/>
+            <w:tcMar>
+              <w:top w:w="15" w:type="dxa"/>
+              <w:start w:w="90" w:type="dxa"/>
+              <w:bottom w:w="15" w:type="dxa"/>
+              <w:end w:w="0" w:type="dxa"/>
+            </w:tcMar>
+            <w:vAlign w:val="center"/>
+            <w:shd w:fill="456875"/>
+          </w:tcPr>
+          <w:p>
+            <w:pPr>
+              <w:keepNext w:val="0"/>
+              <w:spacing w:before="0" w:after="0" w:line="240" w:lineRule="auto"/>
+            </w:pPr>
+            <w:r>
+              <w:rPr>
+                <w:rFonts w:ascii="Microsoft YaHei" w:hAnsi="Microsoft YaHei" w:eastAsia="Microsoft YaHei"/>
+                <w:b w:val="0"/>
+                <w:color w:val="FFFFFF"/>
+                <w:sz w:val="20"/>
+              </w:rPr>
+              <w:t>自我评价</w:t>
+            </w:r>
+          </w:p>
+        </w:tc>
+        <w:tc>
+          <w:tcPr>
+            <w:tcW w:type="dxa" w:w="3326"/>
+            <w:tcMar>
+              <w:top w:w="15" w:type="dxa"/>
+              <w:start w:w="90" w:type="dxa"/>
+              <w:bottom w:w="15" w:type="dxa"/>
+              <w:end w:w="0" w:type="dxa"/>
+            </w:tcMar>
+            <w:vAlign w:val="center"/>
+            <w:shd w:fill="9DB6BE"/>
+          </w:tcPr>
+          <w:p>
+            <w:r/>
+          </w:p>
+        </w:tc>
+        <w:tc>
+          <w:tcPr>
+            <w:tcW w:type="dxa" w:w="3326"/>
+            <w:tcMar>
+              <w:top w:w="15" w:type="dxa"/>
+              <w:start w:w="90" w:type="dxa"/>
+              <w:bottom w:w="15" w:type="dxa"/>
+              <w:end w:w="0" w:type="dxa"/>
+            </w:tcMar>
+            <w:vAlign w:val="center"/>
+            <w:tcBorders>
+              <w:bottom w:val="single" w:sz="7" w:color="8FA7AF"/>
+            </w:tcBorders>
+          </w:tcPr>
+          <w:p>
+            <w:r/>
+          </w:p>
+        </w:tc>
+      </w:tr>
+    </w:tbl>
+    <w:p>
+      <w:pPr>
+        <w:keepNext w:val="0"/>
+        <w:spacing w:before="0" w:after="0" w:line="60" w:lineRule="auto"/>
+      </w:pPr>
+    </w:p>
+    <w:p>
+      <w:pPr>
+        <w:keepNext w:val="0"/>
+        <w:spacing w:before="0" w:after="0" w:line="276" w:lineRule="auto"/>
       </w:pPr>
       <w:r>
         <w:rPr>
           <w:rFonts w:ascii="Microsoft YaHei" w:hAnsi="Microsoft YaHei" w:eastAsia="Microsoft YaHei"/>
           <w:b w:val="0"/>
-          <w:color w:val="000000"/>
+          <w:color w:val="263238"/>
           <w:sz w:val="18"/>
         </w:rPr>
-        <w:t>摄影与现场：产品静物布景与基础用光，影棚布光协作，机位、景别与画面序列规划。</w:t>
-      </w:r>
-    </w:p>
-    <w:p>
-      <w:pPr>
-        <w:spacing w:after="40"/>
-      </w:pPr>
-      <w:r>
-        <w:rPr>
-          <w:rFonts w:ascii="Microsoft YaHei" w:hAnsi="Microsoft YaHei" w:eastAsia="Microsoft YaHei"/>
-          <w:b w:val="0"/>
-          <w:color w:val="000000"/>
-          <w:sz w:val="18"/>
-        </w:rPr>
-        <w:t>后期与交付：Photoshop 修图与合成，CR3、DNG、XMP、TIF 素材整理；明确标注 AI 图像与实拍作品。</w:t>
-      </w:r>
-    </w:p>
-    <w:p>
-      <w:pPr>
-        <w:spacing w:after="20"/>
-      </w:pPr>
-      <w:r>
-        <w:rPr>
-          <w:rFonts w:ascii="Microsoft YaHei" w:hAnsi="Microsoft YaHei" w:eastAsia="Microsoft YaHei"/>
-          <w:b w:val="0"/>
-          <w:color w:val="000000"/>
-          <w:sz w:val="18"/>
-        </w:rPr>
-        <w:t>策划与协作：拍摄方案与流程安排、PPT 汇报、NVivo 访谈编码及秀米图文排版。</w:t>
-      </w:r>
-    </w:p>
-    <w:p>
-      <w:pPr>
-        <w:pStyle w:val="Heading1"/>
-      </w:pPr>
-      <w:r>
-        <w:t>校园经历</w:t>
-      </w:r>
-    </w:p>
-    <w:p>
-      <w:pPr>
-        <w:spacing w:after="0"/>
-      </w:pPr>
-      <w:r>
-        <w:rPr>
-          <w:rFonts w:ascii="Microsoft YaHei" w:hAnsi="Microsoft YaHei" w:eastAsia="Microsoft YaHei"/>
-          <w:b w:val="0"/>
-          <w:color w:val="000000"/>
-          <w:sz w:val="18"/>
-        </w:rPr>
-        <w:t>湖北美术学院视觉艺术设计学院团委调研部干事（2023.09—2024.09）：参与校园推文撰写与秀米排版，配合部门日常内容工作。</w:t>
+        <w:t>具备从前期构思、现场拍摄到后期整理的完整项目参与经验；重视画面细节、团队协作和素材交付。</w:t>
       </w:r>
     </w:p>
     <w:sectPr>
-      <w:pgSz w:w="11906" w:h="16838"/>
-      <w:pgMar w:top="794" w:right="935" w:bottom="737" w:left="935" w:header="720" w:footer="720" w:gutter="0"/>
+      <w:pgSz w:w="11909" w:h="16834"/>
+      <w:pgMar w:top="792" w:right="965" w:bottom="720" w:left="965" w:header="360" w:footer="360" w:gutter="0"/>
       <w:cols w:space="720"/>
       <w:docGrid w:linePitch="360"/>
     </w:sectPr>
@@ -765,11 +1665,11 @@
     <w:qFormat/>
     <w:rsid w:val="00FC693F"/>
     <w:pPr>
-      <w:spacing w:before="0" w:after="0" w:line="276" w:lineRule="auto"/>
+      <w:spacing w:after="0" w:line="264" w:lineRule="auto"/>
     </w:pPr>
     <w:rPr>
       <w:rFonts w:ascii="Microsoft YaHei" w:hAnsi="Microsoft YaHei"/>
-      <w:color w:val="000000"/>
+      <w:color w:val="263238"/>
       <w:sz w:val="18"/>
     </w:rPr>
   </w:style>
@@ -828,15 +1728,15 @@
     <w:pPr>
       <w:keepNext/>
       <w:keepLines/>
-      <w:spacing w:before="180" w:after="60"/>
+      <w:spacing w:before="480" w:after="0"/>
       <w:outlineLvl w:val="0"/>
     </w:pPr>
     <w:rPr>
-      <w:rFonts w:asciiTheme="majorHAnsi" w:eastAsiaTheme="majorEastAsia" w:hAnsiTheme="majorHAnsi" w:cstheme="majorBidi" w:ascii="Microsoft YaHei" w:hAnsi="Microsoft YaHei"/>
+      <w:rFonts w:asciiTheme="majorHAnsi" w:eastAsiaTheme="majorEastAsia" w:hAnsiTheme="majorHAnsi" w:cstheme="majorBidi"/>
       <w:b/>
       <w:bCs/>
-      <w:color w:val="000000"/>
-      <w:sz w:val="22"/>
+      <w:color w:val="365F91" w:themeColor="accent1" w:themeShade="BF"/>
+      <w:sz w:val="28"/>
       <w:szCs w:val="28"/>
     </w:rPr>
   </w:style>
@@ -1114,16 +2014,18 @@
     <w:qFormat/>
     <w:rsid w:val="00FC693F"/>
     <w:pPr>
-      <w:spacing w:after="80" w:line="240" w:lineRule="auto"/>
+      <w:pBdr>
+        <w:bottom w:val="single" w:sz="8" w:space="4" w:color="4F81BD" w:themeColor="accent1"/>
+      </w:pBdr>
+      <w:spacing w:after="300" w:line="240" w:lineRule="auto"/>
       <w:contextualSpacing/>
     </w:pPr>
     <w:rPr>
-      <w:rFonts w:asciiTheme="majorHAnsi" w:eastAsiaTheme="majorEastAsia" w:hAnsiTheme="majorHAnsi" w:cstheme="majorBidi" w:ascii="Microsoft YaHei" w:hAnsi="Microsoft YaHei"/>
-      <w:b/>
-      <w:color w:val="000000"/>
+      <w:rFonts w:asciiTheme="majorHAnsi" w:eastAsiaTheme="majorEastAsia" w:hAnsiTheme="majorHAnsi" w:cstheme="majorBidi"/>
+      <w:color w:val="17365D" w:themeColor="text2" w:themeShade="BF"/>
       <w:spacing w:val="5"/>
       <w:kern w:val="28"/>
-      <w:sz w:val="38"/>
+      <w:sz w:val="52"/>
       <w:szCs w:val="52"/>
     </w:rPr>
   </w:style>
@@ -12452,20 +13354,6 @@
         <w:shd w:val="clear" w:color="auto" w:fill="FBCAA2" w:themeFill="accent6" w:themeFillTint="7F"/>
       </w:tcPr>
     </w:tblStylePr>
-  </w:style>
-  <w:style w:type="paragraph" w:customStyle="1" w:styleId="ProjectHeading">
-    <w:name w:val="Project Heading"/>
-    <w:basedOn w:val="Normal"/>
-    <w:pPr>
-      <w:keepNext/>
-      <w:spacing w:before="100" w:after="40"/>
-    </w:pPr>
-    <w:rPr>
-      <w:rFonts w:ascii="Microsoft YaHei" w:hAnsi="Microsoft YaHei"/>
-      <w:b/>
-      <w:color w:val="000000"/>
-      <w:sz w:val="19"/>
-    </w:rPr>
   </w:style>
 </w:styles>
 </file>

</xml_diff>

<commit_message>
Correct contact email and expand photography resume
</commit_message>
<xml_diff>
--- a/downloads/resume.docx
+++ b/downloads/resume.docx
@@ -118,7 +118,7 @@
     <w:p>
       <w:pPr>
         <w:keepNext w:val="0"/>
-        <w:spacing w:before="120" w:after="0" w:line="96" w:lineRule="auto"/>
+        <w:spacing w:before="60" w:after="0" w:line="96" w:lineRule="auto"/>
       </w:pPr>
     </w:p>
     <w:tbl>
@@ -369,7 +369,7 @@
                 <w:color w:val="263238"/>
                 <w:sz w:val="18"/>
               </w:rPr>
-              <w:t>2023050697@qq.com</w:t>
+              <w:t>2037193242@qq.com</w:t>
             </w:r>
           </w:p>
           <w:p>
@@ -455,7 +455,7 @@
     <w:p>
       <w:pPr>
         <w:keepNext w:val="0"/>
-        <w:spacing w:before="120" w:after="0" w:line="96" w:lineRule="auto"/>
+        <w:spacing w:before="60" w:after="0" w:line="96" w:lineRule="auto"/>
       </w:pPr>
     </w:p>
     <w:tbl>
@@ -583,31 +583,7 @@
     <w:p>
       <w:pPr>
         <w:keepNext w:val="0"/>
-        <w:spacing w:before="0" w:after="0" w:line="264" w:lineRule="auto"/>
-      </w:pPr>
-      <w:r>
-        <w:rPr>
-          <w:rFonts w:ascii="Microsoft YaHei" w:hAnsi="Microsoft YaHei" w:eastAsia="Microsoft YaHei"/>
-          <w:b/>
-          <w:color w:val="456875"/>
-          <w:sz w:val="18"/>
-        </w:rPr>
-        <w:t>创作方向：</w:t>
-      </w:r>
-      <w:r>
-        <w:rPr>
-          <w:rFonts w:ascii="Microsoft YaHei" w:hAnsi="Microsoft YaHei" w:eastAsia="Microsoft YaHei"/>
-          <w:b w:val="0"/>
-          <w:color w:val="263238"/>
-          <w:sz w:val="18"/>
-        </w:rPr>
-        <w:t>时尚人像、商业静物、建筑摄影与数字影像。</w:t>
-      </w:r>
-    </w:p>
-    <w:p>
-      <w:pPr>
-        <w:keepNext w:val="0"/>
-        <w:spacing w:before="120" w:after="0" w:line="96" w:lineRule="auto"/>
+        <w:spacing w:before="60" w:after="0" w:line="96" w:lineRule="auto"/>
       </w:pPr>
     </w:p>
     <w:tbl>
@@ -735,7 +711,7 @@
     <w:p>
       <w:pPr>
         <w:keepNext w:val="0"/>
-        <w:spacing w:before="0" w:after="100" w:line="271" w:lineRule="auto"/>
+        <w:spacing w:before="0" w:after="60" w:line="271" w:lineRule="auto"/>
         <w:ind w:left="230" w:hanging="173"/>
       </w:pPr>
       <w:r>
@@ -745,7 +721,7 @@
           <w:color w:val="263238"/>
           <w:sz w:val="18"/>
         </w:rPr>
-        <w:t>•  制作前期策划 PPT 与拍摄方案，规划景别、动作和机位；参与现场布光，并独立拍摄系列中的近景肖像。</w:t>
+        <w:t>•  负责前期策划 PPT 与拍摄方案，规划画面景别、模特动作和机位；参与现场布光与拍摄协调，拍摄墨镜近景肖像。</w:t>
       </w:r>
     </w:p>
     <w:p>
@@ -788,7 +764,7 @@
     <w:p>
       <w:pPr>
         <w:keepNext w:val="0"/>
-        <w:spacing w:before="0" w:after="100" w:line="271" w:lineRule="auto"/>
+        <w:spacing w:before="0" w:after="60" w:line="271" w:lineRule="auto"/>
         <w:ind w:left="230" w:hanging="173"/>
       </w:pPr>
       <w:r>
@@ -798,7 +774,7 @@
           <w:color w:val="263238"/>
           <w:sz w:val="18"/>
         </w:rPr>
-        <w:t>•  围绕红茶包装与绿色茶罐搭建两组布景，使用茶具、木质道具及枝花组织画面，完成拍摄与基础后期。</w:t>
+        <w:t>•  独立完成红茶包装与绿色茶罐两组产品画面。根据包装色彩选择茶具、木质道具与植物，调整布景、机位和光线，完成拍摄与基础修图。</w:t>
       </w:r>
     </w:p>
     <w:p>
@@ -841,7 +817,7 @@
     <w:p>
       <w:pPr>
         <w:keepNext w:val="0"/>
-        <w:spacing w:before="0" w:after="100" w:line="271" w:lineRule="auto"/>
+        <w:spacing w:before="0" w:after="60" w:line="271" w:lineRule="auto"/>
         <w:ind w:left="230" w:hanging="173"/>
       </w:pPr>
       <w:r>
@@ -851,7 +827,7 @@
           <w:color w:val="263238"/>
           <w:sz w:val="18"/>
         </w:rPr>
-        <w:t>•  以电子屏幕代替人物面孔创作系列图像；结合 AI 视频生成与后期剪辑，完成约 29 秒的实验短片。</w:t>
+        <w:t>•  围绕屏幕替代人脸的设定制作系列图像，并用 AI 生成、镜头筛选和后期剪辑完成约 29 秒的实验短片；通过屏幕与群像表现数字意识主题。</w:t>
       </w:r>
     </w:p>
     <w:p>
@@ -894,7 +870,7 @@
     <w:p>
       <w:pPr>
         <w:keepNext w:val="0"/>
-        <w:spacing w:before="0" w:after="100" w:line="271" w:lineRule="auto"/>
+        <w:spacing w:before="0" w:after="60" w:line="271" w:lineRule="auto"/>
         <w:ind w:left="230" w:hanging="173"/>
       </w:pPr>
       <w:r>
@@ -904,114 +880,52 @@
           <w:color w:val="263238"/>
           <w:sz w:val="18"/>
         </w:rPr>
-        <w:t>•  拍摄黄鹤楼屋檐、檐角与结构细节，完成系列编排，并整理 CR3 原片、调整记录与 TIF 成片。</w:t>
+        <w:t>•  从不同角度拍摄黄鹤楼屋檐、檐角及结构细节，完成系列选片与编排；分类归档 CR3 原片、调整记录和 TIF 成片。</w:t>
       </w:r>
     </w:p>
     <w:p>
       <w:pPr>
-        <w:keepNext w:val="0"/>
-        <w:spacing w:before="120" w:after="0" w:line="96" w:lineRule="auto"/>
-      </w:pPr>
-    </w:p>
-    <w:tbl>
-      <w:tblPr>
-        <w:tblW w:type="auto" w:w="0"/>
-        <w:tblLayout w:type="fixed"/>
-        <w:tblLook w:firstColumn="1" w:firstRow="1" w:lastColumn="0" w:lastRow="0" w:noHBand="0" w:noVBand="1" w:val="04A0"/>
-      </w:tblPr>
-      <w:tblGrid>
-        <w:gridCol w:w="1656"/>
-        <w:gridCol w:w="403"/>
-        <w:gridCol w:w="7920"/>
-      </w:tblGrid>
-      <w:tr>
-        <w:trPr>
-          <w:trHeight w:val="374" w:hRule="atLeast"/>
-        </w:trPr>
-        <w:tc>
-          <w:tcPr>
-            <w:tcW w:type="dxa" w:w="3326"/>
-            <w:tcMar>
-              <w:top w:w="15" w:type="dxa"/>
-              <w:start w:w="90" w:type="dxa"/>
-              <w:bottom w:w="15" w:type="dxa"/>
-              <w:end w:w="0" w:type="dxa"/>
-            </w:tcMar>
-            <w:vAlign w:val="center"/>
-            <w:shd w:fill="456875"/>
-          </w:tcPr>
-          <w:p>
-            <w:pPr>
-              <w:keepNext w:val="0"/>
-              <w:spacing w:before="0" w:after="0" w:line="240" w:lineRule="auto"/>
-            </w:pPr>
-            <w:r>
-              <w:rPr>
-                <w:rFonts w:ascii="Microsoft YaHei" w:hAnsi="Microsoft YaHei" w:eastAsia="Microsoft YaHei"/>
-                <w:b w:val="0"/>
-                <w:color w:val="FFFFFF"/>
-                <w:sz w:val="20"/>
-              </w:rPr>
-              <w:t>校园经历</w:t>
-            </w:r>
-          </w:p>
-        </w:tc>
-        <w:tc>
-          <w:tcPr>
-            <w:tcW w:type="dxa" w:w="3326"/>
-            <w:tcMar>
-              <w:top w:w="15" w:type="dxa"/>
-              <w:start w:w="90" w:type="dxa"/>
-              <w:bottom w:w="15" w:type="dxa"/>
-              <w:end w:w="0" w:type="dxa"/>
-            </w:tcMar>
-            <w:vAlign w:val="center"/>
-            <w:shd w:fill="9DB6BE"/>
-          </w:tcPr>
-          <w:p>
-            <w:r/>
-          </w:p>
-        </w:tc>
-        <w:tc>
-          <w:tcPr>
-            <w:tcW w:type="dxa" w:w="3326"/>
-            <w:tcMar>
-              <w:top w:w="15" w:type="dxa"/>
-              <w:start w:w="90" w:type="dxa"/>
-              <w:bottom w:w="15" w:type="dxa"/>
-              <w:end w:w="0" w:type="dxa"/>
-            </w:tcMar>
-            <w:vAlign w:val="center"/>
-            <w:tcBorders>
-              <w:bottom w:val="single" w:sz="7" w:color="8FA7AF"/>
-            </w:tcBorders>
-          </w:tcPr>
-          <w:p>
-            <w:r/>
-          </w:p>
-        </w:tc>
-      </w:tr>
-    </w:tbl>
-    <w:p>
-      <w:pPr>
-        <w:keepNext w:val="0"/>
-        <w:spacing w:before="0" w:after="0" w:line="60" w:lineRule="auto"/>
-      </w:pPr>
-    </w:p>
-    <w:p>
-      <w:pPr>
-        <w:keepNext w:val="0"/>
-        <w:spacing w:before="0" w:after="0" w:line="276" w:lineRule="auto"/>
+        <w:keepNext/>
+        <w:tabs>
+          <w:tab w:pos="9821" w:val="right"/>
+        </w:tabs>
+        <w:spacing w:before="20" w:after="20" w:line="252" w:lineRule="auto"/>
       </w:pPr>
       <w:r>
         <w:rPr>
           <w:rFonts w:ascii="Microsoft YaHei" w:hAnsi="Microsoft YaHei" w:eastAsia="Microsoft YaHei"/>
           <w:b/>
           <w:color w:val="263238"/>
-          <w:sz w:val="18"/>
+          <w:sz w:val="19"/>
         </w:rPr>
-        <w:t xml:space="preserve">学院团委调研部干事  </w:t>
+        <w:t>汉服视觉传播调研</w:t>
       </w:r>
+      <w:r>
+        <w:rPr>
+          <w:rFonts w:ascii="Microsoft YaHei" w:hAnsi="Microsoft YaHei" w:eastAsia="Microsoft YaHei"/>
+          <w:b w:val="0"/>
+          <w:color w:val="667278"/>
+          <w:sz w:val="17"/>
+        </w:rPr>
+        <w:t xml:space="preserve">  ·  团队课程项目</w:t>
+      </w:r>
+      <w:r>
+        <w:rPr>
+          <w:rFonts w:ascii="Microsoft YaHei" w:hAnsi="Microsoft YaHei" w:eastAsia="Microsoft YaHei"/>
+          <w:b w:val="0"/>
+          <w:color w:val="667278"/>
+          <w:sz w:val="17"/>
+        </w:rPr>
+        <w:tab/>
+        <w:t>课程项目</w:t>
+      </w:r>
+    </w:p>
+    <w:p>
+      <w:pPr>
+        <w:keepNext w:val="0"/>
+        <w:spacing w:before="0" w:after="60" w:line="271" w:lineRule="auto"/>
+        <w:ind w:left="230" w:hanging="173"/>
+      </w:pPr>
       <w:r>
         <w:rPr>
           <w:rFonts w:ascii="Microsoft YaHei" w:hAnsi="Microsoft YaHei" w:eastAsia="Microsoft YaHei"/>
@@ -1019,13 +933,13 @@
           <w:color w:val="263238"/>
           <w:sz w:val="18"/>
         </w:rPr>
-        <w:t>2023.09—2024.09   参与校园推文撰写与秀米排版，配合部门日常内容工作。</w:t>
+        <w:t>•  参与 9 位受访者的微信和电话访谈，协助整理访谈资料与视觉传播建议；共同完成图文排版、海报和项目报告。</w:t>
       </w:r>
     </w:p>
     <w:p>
       <w:pPr>
         <w:keepNext w:val="0"/>
-        <w:spacing w:before="120" w:after="0" w:line="96" w:lineRule="auto"/>
+        <w:spacing w:before="60" w:after="0" w:line="96" w:lineRule="auto"/>
       </w:pPr>
     </w:p>
     <w:tbl>
@@ -1116,7 +1030,7 @@
     <w:p>
       <w:pPr>
         <w:keepNext w:val="0"/>
-        <w:spacing w:before="0" w:after="60" w:line="269" w:lineRule="auto"/>
+        <w:spacing w:before="0" w:after="40" w:line="269" w:lineRule="auto"/>
       </w:pPr>
       <w:r>
         <w:rPr>
@@ -1140,7 +1054,7 @@
     <w:p>
       <w:pPr>
         <w:keepNext w:val="0"/>
-        <w:spacing w:before="0" w:after="60" w:line="269" w:lineRule="auto"/>
+        <w:spacing w:before="0" w:after="40" w:line="269" w:lineRule="auto"/>
       </w:pPr>
       <w:r>
         <w:rPr>
@@ -1164,7 +1078,7 @@
     <w:p>
       <w:pPr>
         <w:keepNext w:val="0"/>
-        <w:spacing w:before="0" w:after="60" w:line="269" w:lineRule="auto"/>
+        <w:spacing w:before="0" w:after="40" w:line="269" w:lineRule="auto"/>
       </w:pPr>
       <w:r>
         <w:rPr>
@@ -1188,7 +1102,7 @@
     <w:p>
       <w:pPr>
         <w:keepNext w:val="0"/>
-        <w:spacing w:before="120" w:after="0" w:line="96" w:lineRule="auto"/>
+        <w:spacing w:before="60" w:after="0" w:line="96" w:lineRule="auto"/>
       </w:pPr>
     </w:p>
     <w:tbl>
@@ -1288,7 +1202,7 @@
           <w:color w:val="263238"/>
           <w:sz w:val="18"/>
         </w:rPr>
-        <w:t>具备从前期构思、现场拍摄到后期整理的完整项目参与经验；重视画面细节、团队协作和素材交付。</w:t>
+        <w:t>具备前期策划、现场拍摄与后期整理的项目经验。时尚摄影中能将画面需求落实为机位、动作和用光安排，愿意配合团队解决现场问题；独立拍摄静物与建筑时，重视构图、色彩和文件归档。希望在摄影师助理或视觉内容岗位继续提升执行能力。</w:t>
       </w:r>
     </w:p>
     <w:sectPr>

</xml_diff>

<commit_message>
Add interview analysis and NVivo to resume
</commit_message>
<xml_diff>
--- a/downloads/resume.docx
+++ b/downloads/resume.docx
@@ -1102,6 +1102,30 @@
     <w:p>
       <w:pPr>
         <w:keepNext w:val="0"/>
+        <w:spacing w:before="0" w:after="40" w:line="269" w:lineRule="auto"/>
+      </w:pPr>
+      <w:r>
+        <w:rPr>
+          <w:rFonts w:ascii="Microsoft YaHei" w:hAnsi="Microsoft YaHei" w:eastAsia="Microsoft YaHei"/>
+          <w:b/>
+          <w:color w:val="456875"/>
+          <w:sz w:val="18"/>
+        </w:rPr>
+        <w:t xml:space="preserve">调研与分析  </w:t>
+      </w:r>
+      <w:r>
+        <w:rPr>
+          <w:rFonts w:ascii="Microsoft YaHei" w:hAnsi="Microsoft YaHei" w:eastAsia="Microsoft YaHei"/>
+          <w:b w:val="0"/>
+          <w:color w:val="263238"/>
+          <w:sz w:val="18"/>
+        </w:rPr>
+        <w:t>访谈录音与文字资料整理；使用 NVivo 进行基础质性编码与主题归纳。</w:t>
+      </w:r>
+    </w:p>
+    <w:p>
+      <w:pPr>
+        <w:keepNext w:val="0"/>
         <w:spacing w:before="60" w:after="0" w:line="96" w:lineRule="auto"/>
       </w:pPr>
     </w:p>

</xml_diff>